<commit_message>
Submission report created via GitHub Action
</commit_message>
<xml_diff>
--- a/submission-report.docx
+++ b/submission-report.docx
@@ -20,7 +20,7 @@
         </w:numPr>
       </w:pPr>
       <w:r>
-        <w:t xml:space="preserve">Submission generated at 12/10/2025 at 20:21:50</w:t>
+        <w:t xml:space="preserve">Submission generated at 12/10/2025 at 20:27:23</w:t>
       </w:r>
     </w:p>
     <w:p>
@@ -32,7 +32,7 @@
         </w:numPr>
       </w:pPr>
       <w:r>
-        <w:t xml:space="preserve">Machine info: Linux runnervm6qbrg 6.11.0-1018-azure #18~24.04.1-Ubuntu SMP Sat Jun 28 04:46:03 UTC 2025 x86_64 x86_64 x86_64 GNU/Linux</w:t>
+        <w:t xml:space="preserve">Machine info: Linux runnervmoqczp 6.11.0-1018-azure #18~24.04.1-Ubuntu SMP Sat Jun 28 04:46:03 UTC 2025 x86_64 x86_64 x86_64 GNU/Linux</w:t>
       </w:r>
     </w:p>
     <w:p>
@@ -33189,6 +33189,30 @@
       </w:r>
       <w:r>
         <w:rPr>
+          <w:rStyle w:val="AlertTok"/>
+        </w:rPr>
+        <w:t xml:space="preserve">![alt text](image.png)</w:t>
+      </w:r>
+      <w:r>
+        <w:br/>
+      </w:r>
+      <w:r>
+        <w:br/>
+      </w:r>
+      <w:r>
+        <w:rPr>
+          <w:rStyle w:val="NormalTok"/>
+        </w:rPr>
+        <w:t xml:space="preserve">Adding these two lines of code fixed my entire project and there aren't anymore leak issues.</w:t>
+      </w:r>
+      <w:r>
+        <w:br/>
+      </w:r>
+      <w:r>
+        <w:br/>
+      </w:r>
+      <w:r>
+        <w:rPr>
           <w:rStyle w:val="FunctionTok"/>
         </w:rPr>
         <w:t xml:space="preserve">### Build Output - makeall</w:t>
@@ -33267,7 +33291,7 @@
         <w:pStyle w:val="FirstParagraph"/>
       </w:pPr>
       <w:r>
-        <w:t xml:space="preserve">Report generated on 12/10/2025 at 20:21:51</w:t>
+        <w:t xml:space="preserve">Report generated on 12/10/2025 at 20:27:25</w:t>
       </w:r>
     </w:p>
     <w:p>
@@ -33355,6 +33379,12 @@
       </w:r>
       <w:r>
         <w:t xml:space="preserve">a7f700bfe11ca40f3c7023cd397c8c7e8e02d89e873dda7b81cf10a4211ec102 submission-report.md</w:t>
+      </w:r>
+      <w:r>
+        <w:t xml:space="preserve"> </w:t>
+      </w:r>
+      <w:r>
+        <w:t xml:space="preserve">aacf06a85446811ac92451d0a0a45eeb299e79156c419a34b5e001d177c0e892 submission-report.md</w:t>
       </w:r>
     </w:p>
     <w:bookmarkEnd w:id="30"/>

</xml_diff>